<commit_message>
Record the verified Production secrets and the Preview environment gap in the todo list
Co-Authored-By: Claude Sonnet 5 <noreply@anthropic.com>
</commit_message>
<xml_diff>
--- a/ETHAN-PRODUCTION-TODO.docx
+++ b/ETHAN-PRODUCTION-TODO.docx
@@ -1237,16 +1237,16 @@
         <w:pStyle w:val="ListBullet"/>
       </w:pPr>
       <w:r>
-        <w:t xml:space="preserve">☐ </w:t>
+        <w:t xml:space="preserve">☑ Checked on 20 September 2026: the </w:t>
       </w:r>
       <w:r>
         <w:rPr>
           <w:b/>
         </w:rPr>
-        <w:t>[You]</w:t>
+        <w:t>Production</w:t>
       </w:r>
       <w:r>
-        <w:t xml:space="preserve"> Confirm the other secrets exist on all three Pages projects: </w:t>
+        <w:t xml:space="preserve"> environment of all three Pages projects already has </w:t>
       </w:r>
       <w:r>
         <w:rPr>
@@ -1268,7 +1268,18 @@
         <w:t>CRON_SECRET</w:t>
       </w:r>
       <w:r>
-        <w:t>, the deploy hook for the admin "Rebuild &amp; deploy" button, and Google sign-in keys for Polokwane and Cape Town.</w:t>
+        <w:t xml:space="preserve">, </w:t>
+      </w:r>
+      <w:r>
+        <w:rPr>
+          <w:rFonts w:ascii="Consolas" w:hAnsi="Consolas"/>
+          <w:color w:val="1F4E8C"/>
+          <w:sz w:val="19"/>
+        </w:rPr>
+        <w:t>GITHUB_DISPATCH_TOKEN</w:t>
+      </w:r>
+      <w:r>
+        <w:t xml:space="preserve"> (the rebuild hook), Google sign-in keys and the four PayFast values. Only their names can be seen, not the values.</w:t>
       </w:r>
     </w:p>
     <w:p>
@@ -1285,7 +1296,42 @@
         <w:t>[You]</w:t>
       </w:r>
       <w:r>
-        <w:t xml:space="preserve"> Confirm </w:t>
+        <w:t xml:space="preserve"> Confirm the PayFast values in Production are the </w:t>
+      </w:r>
+      <w:r>
+        <w:rPr>
+          <w:b/>
+        </w:rPr>
+        <w:t>live</w:t>
+      </w:r>
+      <w:r>
+        <w:t xml:space="preserve"> credentials, not the sandbox ones.</w:t>
+      </w:r>
+    </w:p>
+    <w:p>
+      <w:pPr>
+        <w:pStyle w:val="ListBullet"/>
+      </w:pPr>
+      <w:r>
+        <w:t xml:space="preserve">☐ </w:t>
+      </w:r>
+      <w:r>
+        <w:rPr>
+          <w:b/>
+        </w:rPr>
+        <w:t>[You]</w:t>
+      </w:r>
+      <w:r>
+        <w:t xml:space="preserve"> The </w:t>
+      </w:r>
+      <w:r>
+        <w:rPr>
+          <w:b/>
+        </w:rPr>
+        <w:t>Preview</w:t>
+      </w:r>
+      <w:r>
+        <w:t xml:space="preserve"> environment has no secrets at all, so the dev preview cannot send email, take payments or use Google sign-in (a test message on the Cape Town preview was saved but not emailed). To test those on the preview, add </w:t>
       </w:r>
       <w:r>
         <w:rPr>
@@ -1296,7 +1342,35 @@
         <w:t>RESEND_API_KEY</w:t>
       </w:r>
       <w:r>
-        <w:t xml:space="preserve"> is set on each Pages project (Production and Preview) and that each site's domain is verified in Resend. All email now goes through the website, so without this messages are still saved and visible in the admin Enquiries tab, but nothing is emailed.</w:t>
+        <w:t xml:space="preserve"> (and the PayFast values) to the Preview environment of each project. Production is unaffected.</w:t>
+      </w:r>
+    </w:p>
+    <w:p>
+      <w:pPr>
+        <w:pStyle w:val="ListBullet"/>
+      </w:pPr>
+      <w:r>
+        <w:t xml:space="preserve">☐ </w:t>
+      </w:r>
+      <w:r>
+        <w:rPr>
+          <w:b/>
+        </w:rPr>
+        <w:t>[You]</w:t>
+      </w:r>
+      <w:r>
+        <w:t xml:space="preserve"> Confirm each site's domain is verified in Resend (the key exists in Production; the sender is </w:t>
+      </w:r>
+      <w:r>
+        <w:rPr>
+          <w:rFonts w:ascii="Consolas" w:hAnsi="Consolas"/>
+          <w:color w:val="1F4E8C"/>
+          <w:sz w:val="19"/>
+        </w:rPr>
+        <w:t>hello@&lt;domain&gt;</w:t>
+      </w:r>
+      <w:r>
+        <w:t>). All email now goes through the website, so if a domain is not verified messages are still saved and visible in the admin Enquiries tab, but not emailed.</w:t>
       </w:r>
     </w:p>
     <w:p>

</xml_diff>

<commit_message>
Tidy the production todo list: merge the duplicate PayFast item and renumber the code tasks
Co-Authored-By: Claude Sonnet 5 <noreply@anthropic.com>
</commit_message>
<xml_diff>
--- a/ETHAN-PRODUCTION-TODO.docx
+++ b/ETHAN-PRODUCTION-TODO.docx
@@ -405,7 +405,7 @@
               <w:rPr>
                 <w:sz w:val="19"/>
               </w:rPr>
-              <w:t>2.3</w:t>
+              <w:t>2.2</w:t>
             </w:r>
           </w:p>
         </w:tc>
@@ -477,7 +477,7 @@
               <w:rPr>
                 <w:sz w:val="19"/>
               </w:rPr>
-              <w:t>2.4</w:t>
+              <w:t>2.3</w:t>
             </w:r>
           </w:p>
         </w:tc>
@@ -535,7 +535,7 @@
               <w:rPr>
                 <w:sz w:val="19"/>
               </w:rPr>
-              <w:t>2.5</w:t>
+              <w:t>2.4</w:t>
             </w:r>
           </w:p>
         </w:tc>
@@ -593,7 +593,7 @@
               <w:rPr>
                 <w:sz w:val="19"/>
               </w:rPr>
-              <w:t>2.6</w:t>
+              <w:t>2.5</w:t>
             </w:r>
           </w:p>
         </w:tc>
@@ -679,7 +679,7 @@
               <w:rPr>
                 <w:sz w:val="19"/>
               </w:rPr>
-              <w:t>2.7</w:t>
+              <w:t>2.6</w:t>
             </w:r>
           </w:p>
         </w:tc>
@@ -737,7 +737,7 @@
               <w:rPr>
                 <w:sz w:val="19"/>
               </w:rPr>
-              <w:t>2.8</w:t>
+              <w:t>2.7</w:t>
             </w:r>
           </w:p>
         </w:tc>
@@ -795,7 +795,7 @@
               <w:rPr>
                 <w:sz w:val="19"/>
               </w:rPr>
-              <w:t>2.10</w:t>
+              <w:t>2.8</w:t>
             </w:r>
           </w:p>
         </w:tc>
@@ -1073,7 +1073,7 @@
         <w:t>[Me]</w:t>
       </w:r>
       <w:r>
-        <w:t xml:space="preserve"> Publish the first news stories for Pretoria and Polokwane (run their news routines).</w:t>
+        <w:t xml:space="preserve"> Publish the first news stories for Pretoria and Polokwane (run their news routines). Their news tables are empty, so the homepage news panel stays hidden there until this is done.</w:t>
       </w:r>
     </w:p>
     <w:p>
@@ -1220,23 +1220,6 @@
         <w:pStyle w:val="ListBullet"/>
       </w:pPr>
       <w:r>
-        <w:t xml:space="preserve">☐ </w:t>
-      </w:r>
-      <w:r>
-        <w:rPr>
-          <w:b/>
-        </w:rPr>
-        <w:t>[You]</w:t>
-      </w:r>
-      <w:r>
-        <w:t xml:space="preserve"> Live PayFast merchant ID, key, passphrase and host as secrets on all three Pages projects (currently sandbox).</w:t>
-      </w:r>
-    </w:p>
-    <w:p>
-      <w:pPr>
-        <w:pStyle w:val="ListBullet"/>
-      </w:pPr>
-      <w:r>
         <w:t xml:space="preserve">☑ Checked on 20 September 2026: the </w:t>
       </w:r>
       <w:r>
@@ -1296,7 +1279,7 @@
         <w:t>[You]</w:t>
       </w:r>
       <w:r>
-        <w:t xml:space="preserve"> Confirm the PayFast values in Production are the </w:t>
+        <w:t xml:space="preserve"> Switch PayFast to </w:t>
       </w:r>
       <w:r>
         <w:rPr>
@@ -1305,7 +1288,7 @@
         <w:t>live</w:t>
       </w:r>
       <w:r>
-        <w:t xml:space="preserve"> credentials, not the sandbox ones.</w:t>
+        <w:t xml:space="preserve"> credentials: check that the merchant ID, key, passphrase and host stored in Production on all three projects are the live ones, not the sandbox ones.</w:t>
       </w:r>
     </w:p>
     <w:p>

</xml_diff>

<commit_message>
Record live verification of event submission, approval and the admin endpoints in the todo list
Co-Authored-By: Claude Sonnet 5 <noreply@anthropic.com>
</commit_message>
<xml_diff>
--- a/ETHAN-PRODUCTION-TODO.docx
+++ b/ETHAN-PRODUCTION-TODO.docx
@@ -543,7 +543,7 @@
               <w:rPr>
                 <w:sz w:val="19"/>
               </w:rPr>
-              <w:t>Exercise the remaining endpoints against the real database: claim, submit-event and approve, admin listings, guide sponsorship. (Contact, enquiry and add-business with approval are already verified live.)</w:t>
+              <w:t>Exercise the last endpoints against the real database: claim and guide-sponsorship checkout. (Verified live on 20 Sept: contact, enquiry, add-business with approval, submit-event with approve and delete, and all nine admin endpoints answering with real data.)</w:t>
             </w:r>
           </w:p>
         </w:tc>
@@ -571,7 +571,7 @@
               <w:rPr>
                 <w:sz w:val="19"/>
               </w:rPr>
-              <w:t>The rest were only tested with mocked responses</w:t>
+              <w:t>Claim needs a signed-in owner with a document upload; guide sponsorship needs PayFast values in Preview (item 2.1)</w:t>
             </w:r>
           </w:p>
         </w:tc>

</xml_diff>

<commit_message>
Clear four dead business websites in Cape Town and add the map upgrade to the todo list
Co-Authored-By: Claude Sonnet 5 <noreply@anthropic.com>
</commit_message>
<xml_diff>
--- a/ETHAN-PRODUCTION-TODO.docx
+++ b/ETHAN-PRODUCTION-TODO.docx
@@ -806,16 +806,7 @@
         <w:pStyle w:val="ListBullet"/>
       </w:pPr>
       <w:r>
-        <w:t xml:space="preserve">☐ </w:t>
-      </w:r>
-      <w:r>
-        <w:rPr>
-          <w:b/>
-        </w:rPr>
-        <w:t>[You/Me]</w:t>
-      </w:r>
-      <w:r>
-        <w:t xml:space="preserve"> Remove or fix the dead business websites (</w:t>
+        <w:t>☑ The four dead business websites (</w:t>
       </w:r>
       <w:r>
         <w:rPr>
@@ -848,7 +839,7 @@
         <w:t>arcww.co.za</w:t>
       </w:r>
       <w:r>
-        <w:t xml:space="preserve"> and </w:t>
+        <w:t xml:space="preserve"> serves a 404 and </w:t>
       </w:r>
       <w:r>
         <w:rPr>
@@ -859,7 +850,24 @@
         <w:t>apnisleep.co.za</w:t>
       </w:r>
       <w:r>
-        <w:t xml:space="preserve"> returned errors). Needs your call on whether to clear them.</w:t>
+        <w:t xml:space="preserve"> a 500) were cleared from the Cape Town database on 20 September, so those listings no longer show a broken Website button.</w:t>
+      </w:r>
+    </w:p>
+    <w:p>
+      <w:pPr>
+        <w:pStyle w:val="ListBullet"/>
+      </w:pPr>
+      <w:r>
+        <w:t xml:space="preserve">☐ </w:t>
+      </w:r>
+      <w:r>
+        <w:rPr>
+          <w:b/>
+        </w:rPr>
+        <w:t>[Me]</w:t>
+      </w:r>
+      <w:r>
+        <w:t xml:space="preserve"> Proper map (Property24 style): business pins, suburb boundaries, a production-grade map provider. Plan sent 20 September; needs your go-ahead and a provider choice.</w:t>
       </w:r>
     </w:p>
     <w:p>

</xml_diff>

<commit_message>
Let Featured businesses link their Instagram, Facebook, LinkedIn and YouTube pages
Co-Authored-By: Claude Sonnet 5 <noreply@anthropic.com>
</commit_message>
<xml_diff>
--- a/ETHAN-PRODUCTION-TODO.docx
+++ b/ETHAN-PRODUCTION-TODO.docx
@@ -382,6 +382,23 @@
       </w:r>
       <w:r>
         <w:t xml:space="preserve"> When someone claims a business that has an email on file, the verification link is sent to that business address (never the claimant's), and the claimant gets an email saying the claim only completes once someone confirms it from that inbox. Confirming approves the claim automatically; "this isn't us" rejects it; links last 14 days. If the business has no email on file the claim falls back to manual review by an admin. Only 43 of 645 Cape Town, 172 of 9,660 Pretoria and 167 of 1,055 Polokwane businesses have an email on file, so most claims will still be manual until emails are added (see section 4).</w:t>
+      </w:r>
+    </w:p>
+    <w:p>
+      <w:pPr>
+        <w:pStyle w:val="ListBullet"/>
+      </w:pPr>
+      <w:r>
+        <w:t xml:space="preserve">☑ </w:t>
+      </w:r>
+      <w:r>
+        <w:rPr>
+          <w:b/>
+        </w:rPr>
+        <w:t>Featured plan: social page links.</w:t>
+      </w:r>
+      <w:r>
+        <w:t xml:space="preserve"> Featured businesses can add Instagram, Facebook, LinkedIn and YouTube page links from My businesses &gt; Edit listing (each checked to be a real link to that network, saved only while the plan is active). They show as buttons on the public business page while the business is Featured, and are kept but hidden if it downgrades. Listed in the Featured perks on the pricing page and plan picker. New columns on businesses (migration Cape Town 0042, Pretoria 0041, Polokwane 0044, applied to all three).</w:t>
       </w:r>
     </w:p>
     <w:p>

</xml_diff>

<commit_message>
Note the D1 daily read limit and the build read-reduction task in the todo list
Co-Authored-By: Claude Sonnet 5 <noreply@anthropic.com>
</commit_message>
<xml_diff>
--- a/ETHAN-PRODUCTION-TODO.docx
+++ b/ETHAN-PRODUCTION-TODO.docx
@@ -990,6 +990,49 @@
         <w:pStyle w:val="ListBullet"/>
       </w:pPr>
       <w:r>
+        <w:t xml:space="preserve">☐ </w:t>
+      </w:r>
+      <w:r>
+        <w:rPr>
+          <w:b/>
+        </w:rPr>
+        <w:t>[You]</w:t>
+      </w:r>
+      <w:r>
+        <w:t xml:space="preserve"> Cloudflare D1 </w:t>
+      </w:r>
+      <w:r>
+        <w:rPr>
+          <w:b/>
+        </w:rPr>
+        <w:t>free plan daily read limit</w:t>
+      </w:r>
+      <w:r>
+        <w:t xml:space="preserve"> was reached on 20 September (Cloudflare error 7500) after many test builds: every build reads all three databases (Pretoria alone has about 9,660 businesses). The limit resets at midnight UTC (02:00 South African time). Live sites kept working, but builds and deploys that read the databases fail until the reset. Before launch, decide whether to move the Cloudflare account to the Workers Paid plan (about $5 a month, far higher limits) so a busy day of deploys can never block a release.</w:t>
+      </w:r>
+    </w:p>
+    <w:p>
+      <w:pPr>
+        <w:pStyle w:val="ListBullet"/>
+      </w:pPr>
+      <w:r>
+        <w:t xml:space="preserve">☐ </w:t>
+      </w:r>
+      <w:r>
+        <w:rPr>
+          <w:b/>
+        </w:rPr>
+        <w:t>[Me]</w:t>
+      </w:r>
+      <w:r>
+        <w:t xml:space="preserve"> Cut the reads a build needs: reuse the saved database snapshot when nothing changed, and only pull the tables a build uses, so routine and preview deploys stay well inside the free limit.</w:t>
+      </w:r>
+    </w:p>
+    <w:p>
+      <w:pPr>
+        <w:pStyle w:val="ListBullet"/>
+      </w:pPr>
+      <w:r>
         <w:t xml:space="preserve">☑ Checked on 20 September 2026: the </w:t>
       </w:r>
       <w:r>

</xml_diff>

<commit_message>
Drop the business geocoding routine now that the map has no business pins
Co-Authored-By: Claude Sonnet 5 <noreply@anthropic.com>
</commit_message>
<xml_diff>
--- a/ETHAN-PRODUCTION-TODO.docx
+++ b/ETHAN-PRODUCTION-TODO.docx
@@ -1468,23 +1468,6 @@
         <w:rPr>
           <w:b/>
         </w:rPr>
-        <w:t>Map locations:</w:t>
-      </w:r>
-      <w:r>
-        <w:t xml:space="preserve"> geocode any business whose address is new or changed and save its coordinates (needed for the proper map plan; about 1,900 businesses are missing coordinates today).</w:t>
-      </w:r>
-    </w:p>
-    <w:p>
-      <w:pPr>
-        <w:pStyle w:val="ListBullet"/>
-      </w:pPr>
-      <w:r>
-        <w:t xml:space="preserve">☐ </w:t>
-      </w:r>
-      <w:r>
-        <w:rPr>
-          <w:b/>
-        </w:rPr>
         <w:t>Business emails and websites:</w:t>
       </w:r>
       <w:r>
@@ -1556,7 +1539,18 @@
         <w:t>Suburb boundaries:</w:t>
       </w:r>
       <w:r>
-        <w:t xml:space="preserve"> yearly refresh of the boundary shapes for the proper map.</w:t>
+        <w:t xml:space="preserve"> yearly refresh of the suburb outlines for the map (</w:t>
+      </w:r>
+      <w:r>
+        <w:rPr>
+          <w:rFonts w:ascii="Consolas" w:hAnsi="Consolas"/>
+          <w:color w:val="1F4E8C"/>
+          <w:sz w:val="19"/>
+        </w:rPr>
+        <w:t>scripts/fetch-official-boundaries.mjs</w:t>
+      </w:r>
+      <w:r>
+        <w:t>).</w:t>
       </w:r>
     </w:p>
     <w:p>

</xml_diff>

<commit_message>
Add the routines plan document and link it from the todo list
Co-Authored-By: Claude Sonnet 5 <noreply@anthropic.com>
</commit_message>
<xml_diff>
--- a/ETHAN-PRODUCTION-TODO.docx
+++ b/ETHAN-PRODUCTION-TODO.docx
@@ -1323,6 +1323,22 @@
     </w:p>
     <w:p>
       <w:r>
+        <w:t xml:space="preserve">The full plan is in </w:t>
+      </w:r>
+      <w:r>
+        <w:rPr>
+          <w:rFonts w:ascii="Consolas" w:hAnsi="Consolas"/>
+          <w:color w:val="1F4E8C"/>
+          <w:sz w:val="19"/>
+        </w:rPr>
+        <w:t>ROUTINES-PLAN.md</w:t>
+      </w:r>
+      <w:r>
+        <w:t xml:space="preserve"> (inventory, what is inefficient, target set of routines, rollout order and decisions needed).</w:t>
+      </w:r>
+    </w:p>
+    <w:p>
+      <w:r>
         <w:t>Today there are nine runbooks totalling about 3,800 lines. The three business runbooks (700 to 920 lines each) are near-copies with only the city changed, and every run re-reads a lot before it does anything. The aim is routines that do only the work that is needed and nothing else.</w:t>
       </w:r>
     </w:p>

</xml_diff>

<commit_message>
Refresh the todo list, routines plan and change list (fuel regions, push pending)
Co-Authored-By: Claude Sonnet 5 <noreply@anthropic.com>
</commit_message>
<xml_diff>
--- a/ETHAN-PRODUCTION-TODO.docx
+++ b/ETHAN-PRODUCTION-TODO.docx
@@ -39,7 +39,7 @@
     </w:p>
     <w:p>
       <w:r>
-        <w:t xml:space="preserve">Status as of 20 September 2026. </w:t>
+        <w:t xml:space="preserve">Status as of 21 September 2026. </w:t>
       </w:r>
       <w:r>
         <w:rPr>
@@ -399,6 +399,34 @@
       </w:r>
       <w:r>
         <w:t xml:space="preserve"> Featured businesses can add Instagram, Facebook, LinkedIn and YouTube page links from My businesses &gt; Edit listing (each checked to be a real link to that network, saved only while the plan is active). They show as buttons on the public business page while the business is Featured, and are kept but hidden if it downgrades. Listed in the Featured perks on the pricing page and plan picker. New columns on businesses (migration Cape Town 0042, Pretoria 0041, Polokwane 0044, applied to all three).</w:t>
+      </w:r>
+    </w:p>
+    <w:p>
+      <w:pPr>
+        <w:pStyle w:val="ListBullet"/>
+      </w:pPr>
+      <w:r>
+        <w:t xml:space="preserve">☐ </w:t>
+      </w:r>
+      <w:r>
+        <w:rPr>
+          <w:b/>
+        </w:rPr>
+        <w:t>[Me] Push the interactive map and the routine documents.</w:t>
+      </w:r>
+      <w:r>
+        <w:t xml:space="preserve"> They are committed on the </w:t>
+      </w:r>
+      <w:r>
+        <w:rPr>
+          <w:rFonts w:ascii="Consolas" w:hAnsi="Consolas"/>
+          <w:color w:val="1F4E8C"/>
+          <w:sz w:val="19"/>
+        </w:rPr>
+        <w:t>Ethan</w:t>
+      </w:r>
+      <w:r>
+        <w:t xml:space="preserve"> branch but not pushed. Build all three cities first (the Cloudflare D1 read limit that blocked builds resets at 02:00 South African time), then run the link check and the map test on Pretoria and Polokwane, which have not been tested with their real data yet.</w:t>
       </w:r>
     </w:p>
     <w:p>
@@ -1448,7 +1476,7 @@
         <w:t>scripts/fuel-due.mjs</w:t>
       </w:r>
       <w:r>
-        <w:t xml:space="preserve"> so it only runs on the first Wednesday of the month and the two days after. The news runbooks no longer touch fuel.</w:t>
+        <w:t xml:space="preserve"> so it only runs on the first Wednesday of the month and the two days after. Prices are split by region (Cape Town coastal; Pretoria and Polokwane inland), researched once for both. The news runbooks no longer touch fuel.</w:t>
       </w:r>
     </w:p>
     <w:p>

</xml_diff>

<commit_message>
Make company email collection part of the enrichment routine in the plan
Co-Authored-By: Claude Sonnet 5 <noreply@anthropic.com>
</commit_message>
<xml_diff>
--- a/ETHAN-PRODUCTION-TODO.docx
+++ b/ETHAN-PRODUCTION-TODO.docx
@@ -1002,7 +1002,18 @@
         <w:t>[Me]</w:t>
       </w:r>
       <w:r>
-        <w:t xml:space="preserve"> Add business email addresses at scale (only 2 to 7% of listings have one), so claim verification can go to the business inbox instead of a manual review. Best source: the routine that visits each business's own website (see section 7).</w:t>
+        <w:t xml:space="preserve"> Add business email addresses at scale (only 2 to 7% of listings have one), so claim verification can go to the business inbox instead of a manual review. Decided: the description, hours and email enrichment routine (job 4) also collects the company's published contact email, only when empty and only from the business's own site or official listing (see </w:t>
+      </w:r>
+      <w:r>
+        <w:rPr>
+          <w:rFonts w:ascii="Consolas" w:hAnsi="Consolas"/>
+          <w:color w:val="1F4E8C"/>
+          <w:sz w:val="19"/>
+        </w:rPr>
+        <w:t>ROUTINES-PLAN.md</w:t>
+      </w:r>
+      <w:r>
+        <w:t>).</w:t>
       </w:r>
     </w:p>
     <w:p>

</xml_diff>

<commit_message>
Record the PayFast sandbox fix and automatic invoicing in the todo and change lists
Co-Authored-By: Claude Sonnet 5 <noreply@anthropic.com>
</commit_message>
<xml_diff>
--- a/ETHAN-PRODUCTION-TODO.docx
+++ b/ETHAN-PRODUCTION-TODO.docx
@@ -406,16 +406,7 @@
         <w:pStyle w:val="ListBullet"/>
       </w:pPr>
       <w:r>
-        <w:t xml:space="preserve">☐ </w:t>
-      </w:r>
-      <w:r>
-        <w:rPr>
-          <w:b/>
-        </w:rPr>
-        <w:t>[Me] Push the interactive map and the routine documents.</w:t>
-      </w:r>
-      <w:r>
-        <w:t xml:space="preserve"> They are committed on the </w:t>
+        <w:t xml:space="preserve">☑ The interactive map, the rewritten routines and everything since are pushed to </w:t>
       </w:r>
       <w:r>
         <w:rPr>
@@ -426,7 +417,68 @@
         <w:t>Ethan</w:t>
       </w:r>
       <w:r>
-        <w:t xml:space="preserve"> branch but not pushed. Build all three cities first (the Cloudflare D1 read limit that blocked builds resets at 02:00 South African time), then run the link check and the map test on Pretoria and Polokwane, which have not been tested with their real data yet.</w:t>
+        <w:t xml:space="preserve"> and live on the preview.</w:t>
+      </w:r>
+    </w:p>
+    <w:p>
+      <w:pPr>
+        <w:pStyle w:val="ListBullet"/>
+      </w:pPr>
+      <w:r>
+        <w:t xml:space="preserve">☑ </w:t>
+      </w:r>
+      <w:r>
+        <w:rPr>
+          <w:b/>
+        </w:rPr>
+        <w:t>Automatic invoicing.</w:t>
+      </w:r>
+      <w:r>
+        <w:t xml:space="preserve"> Every completed payment (tier upgrade or sponsorship) generates a numbered, branded PDF invoice (site logo, letterhead, PAID stamp, total), stores it in R2, and emails it to the business owner with a copy to the site's own inbox. Owners can redownload it from My businesses &gt; Billing; admins from the Invoices tab. Verified against real data: a test payment produced a correct PDF end to end (content, numbering, idempotent re-runs). New </w:t>
+      </w:r>
+      <w:r>
+        <w:rPr>
+          <w:rFonts w:ascii="Consolas" w:hAnsi="Consolas"/>
+          <w:color w:val="1F4E8C"/>
+          <w:sz w:val="19"/>
+        </w:rPr>
+        <w:t>invoice_number</w:t>
+      </w:r>
+      <w:r>
+        <w:t>/</w:t>
+      </w:r>
+      <w:r>
+        <w:rPr>
+          <w:rFonts w:ascii="Consolas" w:hAnsi="Consolas"/>
+          <w:color w:val="1F4E8C"/>
+          <w:sz w:val="19"/>
+        </w:rPr>
+        <w:t>invoice_pdf_key</w:t>
+      </w:r>
+      <w:r>
+        <w:t>/</w:t>
+      </w:r>
+      <w:r>
+        <w:rPr>
+          <w:rFonts w:ascii="Consolas" w:hAnsi="Consolas"/>
+          <w:color w:val="1F4E8C"/>
+          <w:sz w:val="19"/>
+        </w:rPr>
+        <w:t>invoiced_at</w:t>
+      </w:r>
+      <w:r>
+        <w:t xml:space="preserve"> columns on </w:t>
+      </w:r>
+      <w:r>
+        <w:rPr>
+          <w:rFonts w:ascii="Consolas" w:hAnsi="Consolas"/>
+          <w:color w:val="1F4E8C"/>
+          <w:sz w:val="19"/>
+        </w:rPr>
+        <w:t>payments</w:t>
+      </w:r>
+      <w:r>
+        <w:t xml:space="preserve"> (migration Cape Town 0043, Pretoria 0042, Polokwane 0045, applied to all three). Still open: a company registration number/VAT number/registered address (all optional, shown automatically once set) and an actual live-email test, both blocked on you (see section 5).</w:t>
       </w:r>
     </w:p>
     <w:p>
@@ -564,7 +616,20 @@
               <w:rPr>
                 <w:sz w:val="19"/>
               </w:rPr>
-              <w:t>Run the payment flow end to end on the PayFast sandbox: subscribe, payment notification, cancel, expiry, sponsorship purchase, rejected-listing refund note</w:t>
+              <w:t xml:space="preserve">Run the rest of the payment flow on the PayFast sandbox: payment notification (ITN), cancel, expiry, sponsorship purchase, rejected-listing refund note. Checkout itself is verified (see done list): a real tier-upgrade checkout was signed, sent to the PayFast sandbox and </w:t>
+            </w:r>
+            <w:r>
+              <w:rPr>
+                <w:b/>
+                <w:sz w:val="19"/>
+              </w:rPr>
+              <w:t>accepted</w:t>
+            </w:r>
+            <w:r>
+              <w:rPr>
+                <w:sz w:val="19"/>
+              </w:rPr>
+              <w:t xml:space="preserve"> (redirected to a real payment page) from the live Ethan preview.</w:t>
             </w:r>
           </w:p>
         </w:tc>
@@ -578,7 +643,7 @@
               <w:rPr>
                 <w:sz w:val="19"/>
               </w:rPr>
-              <w:t>Me + You</w:t>
+              <w:t>Me</w:t>
             </w:r>
           </w:p>
         </w:tc>
@@ -592,7 +657,7 @@
               <w:rPr>
                 <w:sz w:val="19"/>
               </w:rPr>
-              <w:t>The biggest untested area. Needs PayFast values in the Preview environment (see section 5)</w:t>
+              <w:t>Preview now has its own PayFast sandbox credentials (see done list), no longer blocked on you</w:t>
             </w:r>
           </w:p>
         </w:tc>
@@ -622,7 +687,7 @@
               <w:rPr>
                 <w:sz w:val="19"/>
               </w:rPr>
-              <w:t>Exercise the last endpoints against the real database: claim (including the new business-email verification, which needs Resend on Preview and a business that has an email) and guide-sponsorship checkout. (Verified live on 20 Sept: contact, enquiry, add-business with approval, submit-event with approve and delete, and all nine admin endpoints answering with real data.)</w:t>
+              <w:t>Exercise the last endpoints against the real database: claim (needs Resend on Preview and a business that has an email) and guide-sponsorship checkout. (Verified live: contact, enquiry, add-business with approval, submit-event with approve and delete, all nine admin endpoints, and a tier-upgrade PayFast checkout accepted by the sandbox.)</w:t>
             </w:r>
           </w:p>
         </w:tc>
@@ -650,7 +715,7 @@
               <w:rPr>
                 <w:sz w:val="19"/>
               </w:rPr>
-              <w:t>Claim needs a signed-in owner with a document upload; guide sponsorship needs PayFast values in Preview (item 2.1)</w:t>
+              <w:t>Claim needs a signed-in owner with a document upload</w:t>
             </w:r>
           </w:p>
         </w:tc>
@@ -766,7 +831,7 @@
               <w:rPr>
                 <w:sz w:val="19"/>
               </w:rPr>
-              <w:t>Add real content where the mockup is empty and you decide to keep it: reviews, views/clicks data, an owner's own enquiries, invoice PDFs</w:t>
+              <w:t>Add real content where the mockup is empty and you decide to keep it: reviews, views/clicks data, an owner's own enquiries</w:t>
             </w:r>
           </w:p>
         </w:tc>
@@ -1175,7 +1240,7 @@
         <w:t>Preview</w:t>
       </w:r>
       <w:r>
-        <w:t xml:space="preserve"> environment has no secrets at all, so the dev preview cannot send email, take payments or use Google sign-in (a test message on the Cape Town preview was saved but not emailed). To test those on the preview, add </w:t>
+        <w:t xml:space="preserve"> environment still has no </w:t>
       </w:r>
       <w:r>
         <w:rPr>
@@ -1186,7 +1251,18 @@
         <w:t>RESEND_API_KEY</w:t>
       </w:r>
       <w:r>
-        <w:t xml:space="preserve"> (and the PayFast values) to the Preview environment of each project. Production is unaffected.</w:t>
+        <w:t xml:space="preserve">, so the dev preview cannot send email or Google sign-in (a test message on the Cape Town preview was saved but not emailed). PayFast is no longer part of this: Preview now has its own sandbox credentials (see below), separate from Production. To test email on preview, add </w:t>
+      </w:r>
+      <w:r>
+        <w:rPr>
+          <w:rFonts w:ascii="Consolas" w:hAnsi="Consolas"/>
+          <w:color w:val="1F4E8C"/>
+          <w:sz w:val="19"/>
+        </w:rPr>
+        <w:t>RESEND_API_KEY</w:t>
+      </w:r>
+      <w:r>
+        <w:t xml:space="preserve"> to the Preview environment of each project. Production is unaffected.</w:t>
       </w:r>
     </w:p>
     <w:p>
@@ -1249,6 +1325,84 @@
       </w:r>
       <w:r>
         <w:t xml:space="preserve"> Real AdSense units in place of the "Advertisement" placeholder boxes; Google Analytics IDs confirmed.</w:t>
+      </w:r>
+    </w:p>
+    <w:p>
+      <w:pPr>
+        <w:pStyle w:val="ListBullet"/>
+      </w:pPr>
+      <w:r>
+        <w:t xml:space="preserve">☑ </w:t>
+      </w:r>
+      <w:r>
+        <w:rPr>
+          <w:b/>
+        </w:rPr>
+        <w:t>PayFast checkout works on the Ethan preview</w:t>
+      </w:r>
+      <w:r>
+        <w:t xml:space="preserve">, with no dashboard access needed: </w:t>
+      </w:r>
+      <w:r>
+        <w:rPr>
+          <w:rFonts w:ascii="Consolas" w:hAnsi="Consolas"/>
+          <w:color w:val="1F4E8C"/>
+          <w:sz w:val="19"/>
+        </w:rPr>
+        <w:t>wrangler.&lt;city&gt;.jsonc</w:t>
+      </w:r>
+      <w:r>
+        <w:t xml:space="preserve">'s </w:t>
+      </w:r>
+      <w:r>
+        <w:rPr>
+          <w:rFonts w:ascii="Consolas" w:hAnsi="Consolas"/>
+          <w:color w:val="1F4E8C"/>
+          <w:sz w:val="19"/>
+        </w:rPr>
+        <w:t>env.preview</w:t>
+      </w:r>
+      <w:r>
+        <w:t xml:space="preserve"> block carries PayFast's own publicly documented sandbox test pair (merchant 10004002 — safe to commit, sandbox-only, no real money) for all three cities. Production is untouched: it keeps its own encrypted PayFast secrets, never read from this file.</w:t>
+      </w:r>
+    </w:p>
+    <w:p>
+      <w:pPr>
+        <w:pStyle w:val="ListBullet"/>
+      </w:pPr>
+      <w:r>
+        <w:t xml:space="preserve">☑ </w:t>
+      </w:r>
+      <w:r>
+        <w:rPr>
+          <w:b/>
+        </w:rPr>
+        <w:t>Found and fixed a real signing bug in `functions/_lib/payfast.ts`</w:t>
+      </w:r>
+      <w:r>
+        <w:t xml:space="preserve">, not just a config problem: a plain tier upgrade always sends </w:t>
+      </w:r>
+      <w:r>
+        <w:rPr>
+          <w:rFonts w:ascii="Consolas" w:hAnsi="Consolas"/>
+          <w:color w:val="1F4E8C"/>
+          <w:sz w:val="19"/>
+        </w:rPr>
+        <w:t>custom_str3: ''</w:t>
+      </w:r>
+      <w:r>
+        <w:t xml:space="preserve"> (no sponsorship target); the signature calculation correctly skipped that empty field, but the actual request sent it anyway, so PayFast recomputed a different signature and rejected every tier-upgrade checkout with "Generated signature does not match submitted signature" — this would have hit production too, sandbox or live. New </w:t>
+      </w:r>
+      <w:r>
+        <w:rPr>
+          <w:rFonts w:ascii="Consolas" w:hAnsi="Consolas"/>
+          <w:color w:val="1F4E8C"/>
+          <w:sz w:val="19"/>
+        </w:rPr>
+        <w:t>buildCheckoutParams()</w:t>
+      </w:r>
+      <w:r>
+        <w:t xml:space="preserve"> builds the outgoing request from the exact same rule the signature uses, so they can't drift apart again. Confirmed fixed directly against the PayFast sandbox (a real checkout now gets redirected to a real payment page).</w:t>
       </w:r>
     </w:p>
     <w:p>

</xml_diff>